<commit_message>
Update book introductions and metadata for all languages for 2026-06-12 release
</commit_message>
<xml_diff>
--- a/eng/docx/01.content.docx
+++ b/eng/docx/01.content.docx
@@ -231,7 +231,35 @@
         <w:rPr>
           <w:lang w:val="en_US" w:bidi="en_US"/>
         </w:rPr>
-        <w:t>Genesis is the book of beginnings—of the universe and of humanity, of sin and its catastrophic effects, and of God’s plan to restore blessing to the world through his chosen people. God began his plan when he called Abraham and made a covenant with him. Genesis traces God’s promised blessings from generation to generation, to the time of bondage and the need for redemption from Egypt. It lays the foundation for God’s subsequent revelation, and most other books of the Bible draw on its contents. Genesis is a source of instruction, comfort, and edification.</w:t>
+        <w:t>Genesis is the book of beginnings. It tells how God created the world and humanity. It explains how sin entered the world and brought suffering and separation from God. It also introduces God’s plan to bring blessing and restoration to the world through the people he chose.</w:t>
+      </w:r>
+    </w:p>
+    <w:p>
+      <w:pPr/>
+      <w:r>
+        <w:rPr>
+          <w:lang w:val="en_US" w:bidi="en_US"/>
+        </w:rPr>
+      </w:r>
+      <w:r>
+        <w:rPr>
+          <w:lang w:val="en_US" w:bidi="en_US"/>
+        </w:rPr>
+        <w:t>God began this plan when he called Abraham and made a covenant (a binding agreement) with him. Genesis follows God’s promises as they pass from one generation to the next. The book ends with Abraham’s descendants living in Egypt, where they later became slaves and needed God’s rescue.</w:t>
+      </w:r>
+    </w:p>
+    <w:p>
+      <w:pPr/>
+      <w:r>
+        <w:rPr>
+          <w:lang w:val="en_US" w:bidi="en_US"/>
+        </w:rPr>
+      </w:r>
+      <w:r>
+        <w:rPr>
+          <w:lang w:val="en_US" w:bidi="en_US"/>
+        </w:rPr>
+        <w:t>Genesis provides the foundation for the rest of the Bible. Many other biblical books refer to its people, events, and teachings. It is a source of instruction, comfort, and encouragement.</w:t>
       </w:r>
     </w:p>
     <w:p>
@@ -256,21 +284,21 @@
         <w:rPr>
           <w:lang w:val="en_US" w:bidi="en_US"/>
         </w:rPr>
-        <w:t>When Genesis was written, the children of Israel had been slaves in Egypt for four hundred years. They had recently been released from bondage and guided through the desert to meet the Lord at Mount Sinai, where he had established his covenant relationship with them and had given them his law through Moses. Israel was now poised to enter the Promised Land and receive the inheritance that God had promised Abraham.</w:t>
-      </w:r>
-    </w:p>
-    <w:p>
-      <w:pPr/>
-      <w:r>
-        <w:rPr>
-          <w:lang w:val="en_US" w:bidi="en_US"/>
-        </w:rPr>
-      </w:r>
-      <w:r>
-        <w:rPr>
-          <w:lang w:val="en_US" w:bidi="en_US"/>
-        </w:rPr>
-        <w:t xml:space="preserve">While enslaved in Egypt, the Israelites had adopted many pagan ideas and customs from their Egyptian masters (see </w:t>
+        <w:t>When Genesis was written, the Israelites had lived as slaves in Egypt for 400 years. God had recently freed them from slavery and led them through the wilderness to Mount Sinai. There, he established his covenant (a binding agreement) with them and gave them his law through Moses. At this point, Israel was preparing to enter the promised land and receive the inheritance that God had promised to Abraham.</w:t>
+      </w:r>
+    </w:p>
+    <w:p>
+      <w:pPr/>
+      <w:r>
+        <w:rPr>
+          <w:lang w:val="en_US" w:bidi="en_US"/>
+        </w:rPr>
+      </w:r>
+      <w:r>
+        <w:rPr>
+          <w:lang w:val="en_US" w:bidi="en_US"/>
+        </w:rPr>
+        <w:t xml:space="preserve">While they were slaves in Egypt, the Israelites adopted many pagan (non-Israelite religious) beliefs and practices from the Egyptians (see </w:t>
       </w:r>
       <w:hyperlink r:id="rId13">
         <w:r>
@@ -281,28 +309,42 @@
             <w:color w:val="0000EE"/>
             <w:u w:val="single"/>
           </w:rPr>
-          <w:t>Exod 32:1–4</w:t>
+          <w:t>Exodus 32:1–4</w:t>
         </w:r>
       </w:hyperlink>
       <w:r>
         <w:rPr>
           <w:lang w:val="en_US" w:bidi="en_US"/>
         </w:rPr>
-        <w:t>). They were influenced by false concepts of God, the world, and human nature, and were reduced to being slaves rather than owners and managers of the land. Perhaps they had forgotten the great promises that God had made to Abraham, Isaac, and Jacob, or perhaps they had concluded that the promises would never be fulfilled.</w:t>
-      </w:r>
-    </w:p>
-    <w:p>
-      <w:pPr/>
-      <w:r>
-        <w:rPr>
-          <w:lang w:val="en_US" w:bidi="en_US"/>
-        </w:rPr>
-      </w:r>
-      <w:r>
-        <w:rPr>
-          <w:lang w:val="en_US" w:bidi="en_US"/>
-        </w:rPr>
-        <w:t>Before entering the Promised Land, the Israelites needed to understand the nature of God, his world, and their place in it more clearly. They needed to embrace their identity as descendants of Abraham, Isaac, and Jacob. Genesis provided the needed understanding.</w:t>
+        <w:t>). As a result, they were influenced by false ideas about God, the world, and human nature. Instead of caring for the land as God intended, they lived as slaves under the control of others.</w:t>
+      </w:r>
+    </w:p>
+    <w:p>
+      <w:pPr/>
+      <w:r>
+        <w:rPr>
+          <w:lang w:val="en_US" w:bidi="en_US"/>
+        </w:rPr>
+      </w:r>
+      <w:r>
+        <w:rPr>
+          <w:lang w:val="en_US" w:bidi="en_US"/>
+        </w:rPr>
+        <w:t>They may have forgotten the promises that God made to Abraham, Isaac, and Jacob. Or they may have believed that those promises would never come true.</w:t>
+      </w:r>
+    </w:p>
+    <w:p>
+      <w:pPr/>
+      <w:r>
+        <w:rPr>
+          <w:lang w:val="en_US" w:bidi="en_US"/>
+        </w:rPr>
+      </w:r>
+      <w:r>
+        <w:rPr>
+          <w:lang w:val="en_US" w:bidi="en_US"/>
+        </w:rPr>
+        <w:t>Before entering the promised land, the Israelites needed to understand God, the world he created, and their role in it more clearly. They also needed to embrace their identity as the descendants of Abraham, Isaac, and Jacob. Genesis helped them understand these things.</w:t>
       </w:r>
     </w:p>
     <w:p>
@@ -327,21 +369,21 @@
         <w:rPr>
           <w:lang w:val="en_US" w:bidi="en_US"/>
         </w:rPr>
-        <w:t>Genesis traces God’s work to overcome with blessing the curse that came on humankind because of sin. The book arranges family traditions, genealogies, historical events, and editorial comments into a single, sustained argument.</w:t>
-      </w:r>
-    </w:p>
-    <w:p>
-      <w:pPr/>
-      <w:r>
-        <w:rPr>
-          <w:lang w:val="en_US" w:bidi="en_US"/>
-        </w:rPr>
-      </w:r>
-      <w:r>
-        <w:rPr>
-          <w:lang w:val="en_US" w:bidi="en_US"/>
-        </w:rPr>
-        <w:t xml:space="preserve">Every section of Genesis but the first has the heading “This is the account” (or </w:t>
+        <w:t>Genesis shows how God worked to bring blessing to humanity and overcome the effects of the curse that came because of sin. The book brings together family histories, genealogies (lists of ancestors), historical events, and editorial comments to present a unified message.</w:t>
+      </w:r>
+    </w:p>
+    <w:p>
+      <w:pPr/>
+      <w:r>
+        <w:rPr>
+          <w:lang w:val="en_US" w:bidi="en_US"/>
+        </w:rPr>
+      </w:r>
+      <w:r>
+        <w:rPr>
+          <w:lang w:val="en_US" w:bidi="en_US"/>
+        </w:rPr>
+        <w:t xml:space="preserve">Every major section of Genesis except the first begins with the heading, “This is the account” (or </w:t>
       </w:r>
       <w:r>
         <w:rPr>
@@ -354,7 +396,47 @@
         <w:rPr>
           <w:lang w:val="en_US" w:bidi="en_US"/>
         </w:rPr>
-        <w:t>; Hebrew toledoth). Each of the toledoth sections explains the history of a line of descent. In each case, a deterioration of well-being is followed by an increasing focus on God’s plan to bless the world. This plan is the basis for God’s covenant with his people; as the blessing develops, the covenant is clarified. By the end of the book, the reader is ready for the fulfillment of the promises.</w:t>
+        <w:t xml:space="preserve">; Hebrew </w:t>
+      </w:r>
+      <w:r>
+        <w:rPr>
+          <w:i/>
+          <w:lang w:val="en_US" w:bidi="en_US"/>
+        </w:rPr>
+        <w:t>toledoth</w:t>
+      </w:r>
+      <w:r>
+        <w:rPr>
+          <w:lang w:val="en_US" w:bidi="en_US"/>
+        </w:rPr>
+        <w:t xml:space="preserve">). Each </w:t>
+      </w:r>
+      <w:r>
+        <w:rPr>
+          <w:i/>
+          <w:lang w:val="en_US" w:bidi="en_US"/>
+        </w:rPr>
+        <w:t>toledoth</w:t>
+      </w:r>
+      <w:r>
+        <w:rPr>
+          <w:lang w:val="en_US" w:bidi="en_US"/>
+        </w:rPr>
+        <w:t xml:space="preserve"> section describes the history of a family line.</w:t>
+      </w:r>
+    </w:p>
+    <w:p>
+      <w:pPr/>
+      <w:r>
+        <w:rPr>
+          <w:lang w:val="en_US" w:bidi="en_US"/>
+        </w:rPr>
+      </w:r>
+      <w:r>
+        <w:rPr>
+          <w:lang w:val="en_US" w:bidi="en_US"/>
+        </w:rPr>
+        <w:t>In each section, people experience a loss of well-being because of sin. At the same time, the story gives greater attention to God's plan to bring blessing to the world. This plan is the foundation of God's covenant with his people. As God's blessing develops, the meaning and purpose of the covenant become clearer. By the end of the book, it becomes clear that God will fulfill his promises.</w:t>
       </w:r>
     </w:p>
     <w:p>
@@ -386,7 +468,20 @@
         <w:rPr>
           <w:lang w:val="en_US" w:bidi="en_US"/>
         </w:rPr>
-        <w:t>) does not have the toledoth heading—it is the account of creation “in the beginning” (</w:t>
+        <w:t xml:space="preserve">) does not have the </w:t>
+      </w:r>
+      <w:r>
+        <w:rPr>
+          <w:i/>
+          <w:lang w:val="en_US" w:bidi="en_US"/>
+        </w:rPr>
+        <w:t>toledoth</w:t>
+      </w:r>
+      <w:r>
+        <w:rPr>
+          <w:lang w:val="en_US" w:bidi="en_US"/>
+        </w:rPr>
+        <w:t xml:space="preserve"> heading. It is the account of creation "in the beginning" (</w:t>
       </w:r>
       <w:hyperlink r:id="rId15">
         <w:r>
@@ -404,7 +499,7 @@
         <w:rPr>
           <w:lang w:val="en_US" w:bidi="en_US"/>
         </w:rPr>
-        <w:t>). The work of creation is wrapped in God’s approval and blessing as he fulfills his plan.</w:t>
+        <w:t>). God's approval and blessing surround the creation work as he completes his plan.</w:t>
       </w:r>
     </w:p>
     <w:p>
@@ -454,7 +549,25 @@
         <w:rPr>
           <w:lang w:val="en_US" w:bidi="en_US"/>
         </w:rPr>
-        <w:t>) and traces what became of God’s creation because of Adam’s and Eve’s sin (</w:t>
+        <w:t>). It then shows what happened to God's creation because of the sin of Adam and Eve. The section describes:</w:t>
+      </w:r>
+    </w:p>
+    <w:p>
+      <w:pPr>
+        <w:pStyle w:val="ListBullet"/>
+        <w:spacing w:line="240" w:lineRule="auto"/>
+        <w:ind w:left="720"/>
+      </w:pPr>
+      <w:r>
+        <w:rPr>
+          <w:lang w:val="en_US" w:bidi="en_US"/>
+        </w:rPr>
+      </w:r>
+      <w:r>
+        <w:rPr>
+          <w:lang w:val="en_US" w:bidi="en_US"/>
+        </w:rPr>
+        <w:t>the consequences of Adam and Eve's sin (</w:t>
       </w:r>
       <w:hyperlink r:id="rId18">
         <w:r>
@@ -472,7 +585,25 @@
         <w:rPr>
           <w:lang w:val="en_US" w:bidi="en_US"/>
         </w:rPr>
-        <w:t>), the curse on their sin (</w:t>
+        <w:t>),</w:t>
+      </w:r>
+    </w:p>
+    <w:p>
+      <w:pPr>
+        <w:pStyle w:val="ListBullet"/>
+        <w:spacing w:line="240" w:lineRule="auto"/>
+        <w:ind w:left="720"/>
+      </w:pPr>
+      <w:r>
+        <w:rPr>
+          <w:lang w:val="en_US" w:bidi="en_US"/>
+        </w:rPr>
+      </w:r>
+      <w:r>
+        <w:rPr>
+          <w:lang w:val="en_US" w:bidi="en_US"/>
+        </w:rPr>
+        <w:t>the curse that followed (</w:t>
       </w:r>
       <w:hyperlink r:id="rId19">
         <w:r>
@@ -490,7 +621,25 @@
         <w:rPr>
           <w:lang w:val="en_US" w:bidi="en_US"/>
         </w:rPr>
-        <w:t>), and the extension of sin to their descendants (</w:t>
+        <w:t>), and</w:t>
+      </w:r>
+    </w:p>
+    <w:p>
+      <w:pPr>
+        <w:pStyle w:val="ListBullet"/>
+        <w:spacing w:line="240" w:lineRule="auto"/>
+        <w:ind w:left="720"/>
+      </w:pPr>
+      <w:r>
+        <w:rPr>
+          <w:lang w:val="en_US" w:bidi="en_US"/>
+        </w:rPr>
+      </w:r>
+      <w:r>
+        <w:rPr>
+          <w:lang w:val="en_US" w:bidi="en_US"/>
+        </w:rPr>
+        <w:t>the spread of sin and its consequences to their descendants (</w:t>
       </w:r>
       <w:hyperlink r:id="rId20">
         <w:r>
@@ -508,21 +657,35 @@
         <w:rPr>
           <w:lang w:val="en_US" w:bidi="en_US"/>
         </w:rPr>
-        <w:t>). Humanity no longer enjoyed God’s rest; instead, they experienced guilt and fear. So they fled from God and developed a civilization marked by pride.</w:t>
-      </w:r>
-    </w:p>
-    <w:p>
-      <w:pPr/>
-      <w:r>
-        <w:rPr>
-          <w:lang w:val="en_US" w:bidi="en_US"/>
-        </w:rPr>
-      </w:r>
-      <w:r>
-        <w:rPr>
-          <w:lang w:val="en_US" w:bidi="en_US"/>
-        </w:rPr>
-        <w:t>Independence from God resulted in the downward drift of human life (</w:t>
+        <w:t xml:space="preserve">). </w:t>
+      </w:r>
+    </w:p>
+    <w:p>
+      <w:pPr/>
+      <w:r>
+        <w:rPr>
+          <w:lang w:val="en_US" w:bidi="en_US"/>
+        </w:rPr>
+      </w:r>
+      <w:r>
+        <w:rPr>
+          <w:lang w:val="en_US" w:bidi="en_US"/>
+        </w:rPr>
+        <w:t>Humanity no longer shared in God's rest. Instead, people experienced guilt and fear. They turned away from God and built a civilization marked by pride.</w:t>
+      </w:r>
+    </w:p>
+    <w:p>
+      <w:pPr/>
+      <w:r>
+        <w:rPr>
+          <w:lang w:val="en_US" w:bidi="en_US"/>
+        </w:rPr>
+      </w:r>
+      <w:r>
+        <w:rPr>
+          <w:lang w:val="en_US" w:bidi="en_US"/>
+        </w:rPr>
+        <w:t>When people chose to live independently from God, human life continued to decline (</w:t>
       </w:r>
       <w:hyperlink r:id="rId21">
         <w:r>
@@ -540,7 +703,7 @@
         <w:rPr>
           <w:lang w:val="en_US" w:bidi="en_US"/>
         </w:rPr>
-        <w:t xml:space="preserve">). The genealogy of </w:t>
+        <w:t xml:space="preserve">). The genealogy in </w:t>
       </w:r>
       <w:hyperlink r:id="rId22">
         <w:r>
@@ -558,7 +721,7 @@
         <w:rPr>
           <w:lang w:val="en_US" w:bidi="en_US"/>
         </w:rPr>
-        <w:t xml:space="preserve"> begins by recalling that human beings were made in God’s image and were blessed by him (</w:t>
+        <w:t xml:space="preserve"> begins by reminding us that God made human beings in his image and blessed them (</w:t>
       </w:r>
       <w:hyperlink r:id="rId23">
         <w:r>
@@ -576,7 +739,7 @@
         <w:rPr>
           <w:lang w:val="en_US" w:bidi="en_US"/>
         </w:rPr>
-        <w:t xml:space="preserve">). As the genealogy is traced, the death of each generation reminds the reader of the curse, with Enoch providing a ray of hope that the curse is not final. In </w:t>
+        <w:t xml:space="preserve">). As the genealogy continues, the repeated record of death in each generation reminds us of the curse. Yet Enoch provides a sign of hope that the curse will not last forever. </w:t>
       </w:r>
       <w:hyperlink r:id="rId24">
         <w:r>
@@ -587,14 +750,14 @@
             <w:color w:val="0000EE"/>
             <w:u w:val="single"/>
           </w:rPr>
-          <w:t>6:1–8</w:t>
+          <w:t>Genesis 6:1–8</w:t>
         </w:r>
       </w:hyperlink>
       <w:r>
         <w:rPr>
           <w:lang w:val="en_US" w:bidi="en_US"/>
         </w:rPr>
-        <w:t>, we learn that God regretted having made humans and decided to judge the earth. Noah, however, received God’s favor and provided a source of hope (</w:t>
+        <w:t xml:space="preserve"> shows that human wickedness became so great that God regretted making human beings and decided to judge the earth. Noah, however, found favor with God and became a source of hope (</w:t>
       </w:r>
       <w:hyperlink r:id="rId25">
         <w:r>
@@ -662,21 +825,21 @@
         <w:rPr>
           <w:lang w:val="en_US" w:bidi="en_US"/>
         </w:rPr>
-        <w:t>) relays the curse of judgment through the flood followed by blessing in a new beginning. Creation was renewed, purged of the abominable evil that had invaded and ruined the human race.</w:t>
-      </w:r>
-    </w:p>
-    <w:p>
-      <w:pPr/>
-      <w:r>
-        <w:rPr>
-          <w:lang w:val="en_US" w:bidi="en_US"/>
-        </w:rPr>
-      </w:r>
-      <w:r>
-        <w:rPr>
-          <w:lang w:val="en_US" w:bidi="en_US"/>
-        </w:rPr>
-        <w:t>But as the world’s population increased and expanded into various nations (</w:t>
+        <w:t xml:space="preserve">) describes the curse of judgment through the flood followed by blessing in a new beginning. God renewed the earth and removed the great evil that had spread through humanity and brought ruin to it. </w:t>
+      </w:r>
+    </w:p>
+    <w:p>
+      <w:pPr/>
+      <w:r>
+        <w:rPr>
+          <w:lang w:val="en_US" w:bidi="en_US"/>
+        </w:rPr>
+      </w:r>
+      <w:r>
+        <w:rPr>
+          <w:lang w:val="en_US" w:bidi="en_US"/>
+        </w:rPr>
+        <w:t>But as the population of the earth grew and people spread out into different nations (</w:t>
       </w:r>
       <w:hyperlink r:id="rId28">
         <w:r>
@@ -694,7 +857,7 @@
         <w:rPr>
           <w:lang w:val="en_US" w:bidi="en_US"/>
         </w:rPr>
-        <w:t>), the people were again bent on disobedience. Because of their rebellion, God dispersed them to prevent greater wickedness (</w:t>
+        <w:t>), they once again chose to disobey God. Because of their rebellion, God scattered them across the earth to prevent even greater evil (</w:t>
       </w:r>
       <w:hyperlink r:id="rId29">
         <w:r>
@@ -744,7 +907,7 @@
         <w:rPr>
           <w:lang w:val="en_US" w:bidi="en_US"/>
         </w:rPr>
-        <w:t xml:space="preserve"> brings the focus to Abram, through whom God chose to bring blessing to all. The rest of the book (</w:t>
+        <w:t xml:space="preserve"> focuses on Abram. Through him, God chose to bring blessing to all people. The rest of the book (</w:t>
       </w:r>
       <w:hyperlink r:id="rId31">
         <w:r>
@@ -762,7 +925,21 @@
         <w:rPr>
           <w:lang w:val="en_US" w:bidi="en_US"/>
         </w:rPr>
-        <w:t>) tells of God’s blessing Abram and his descendants. God first made a covenant with Abram (</w:t>
+        <w:t>) tells how God blessed Abram and his descendants.</w:t>
+      </w:r>
+    </w:p>
+    <w:p>
+      <w:pPr/>
+      <w:r>
+        <w:rPr>
+          <w:lang w:val="en_US" w:bidi="en_US"/>
+        </w:rPr>
+      </w:r>
+      <w:r>
+        <w:rPr>
+          <w:lang w:val="en_US" w:bidi="en_US"/>
+        </w:rPr>
+        <w:t>God first made a covenant with Abram (</w:t>
       </w:r>
       <w:hyperlink r:id="rId32">
         <w:r>
@@ -780,21 +957,21 @@
         <w:rPr>
           <w:lang w:val="en_US" w:bidi="en_US"/>
         </w:rPr>
-        <w:t>), promising him a great nation, land, and name. As time went on, God made the specific terms of the covenant clearer, and Abram’s faith grew deeper.</w:t>
-      </w:r>
-    </w:p>
-    <w:p>
-      <w:pPr/>
-      <w:r>
-        <w:rPr>
-          <w:lang w:val="en_US" w:bidi="en_US"/>
-        </w:rPr>
-      </w:r>
-      <w:r>
-        <w:rPr>
-          <w:lang w:val="en_US" w:bidi="en_US"/>
-        </w:rPr>
-        <w:t>As it discusses each generation, Genesis gives a brief account of the families that are not Israel’s ancestors before turning to the line of Israel. For example, after briefly reporting what became of Ishmael (</w:t>
+        <w:t>). He promised to make Abram into a great nation, give his descendants a land of their own, and make Abram's name great. Over time, God made the details of this covenant clearer, and Abram's faith became stronger.</w:t>
+      </w:r>
+    </w:p>
+    <w:p>
+      <w:pPr/>
+      <w:r>
+        <w:rPr>
+          <w:lang w:val="en_US" w:bidi="en_US"/>
+        </w:rPr>
+      </w:r>
+      <w:r>
+        <w:rPr>
+          <w:lang w:val="en_US" w:bidi="en_US"/>
+        </w:rPr>
+        <w:t>As Genesis describes each generation, it briefly records the history of families that were not part of Israel's ancestral line before returning to the family line that led to Israel. For example, after a short account of Ishmael's descendants (</w:t>
       </w:r>
       <w:hyperlink r:id="rId33">
         <w:r>
@@ -812,7 +989,7 @@
         <w:rPr>
           <w:lang w:val="en_US" w:bidi="en_US"/>
         </w:rPr>
-        <w:t>), Genesis traces in detail what happened to Isaac and his family (</w:t>
+        <w:t>), the book describes in greater detail the life of Isaac and his family (</w:t>
       </w:r>
       <w:hyperlink r:id="rId34">
         <w:r>
@@ -830,7 +1007,7 @@
         <w:rPr>
           <w:lang w:val="en_US" w:bidi="en_US"/>
         </w:rPr>
-        <w:t>). Likewise, Esau’s line (Edom) is dealt with briefly (</w:t>
+        <w:t>). In the same way, Esau's descendants (the Edomites) receive only a brief account (</w:t>
       </w:r>
       <w:hyperlink r:id="rId35">
         <w:r>
@@ -848,7 +1025,7 @@
         <w:rPr>
           <w:lang w:val="en_US" w:bidi="en_US"/>
         </w:rPr>
-        <w:t>) before the lengthy final section, which concerns the chosen line of Jacob the heir (</w:t>
+        <w:t>). Genesis then turns to the longer final section, which focuses on Jacob's family line, the line chosen by God (</w:t>
       </w:r>
       <w:hyperlink r:id="rId36">
         <w:r>
@@ -880,7 +1057,7 @@
         <w:rPr>
           <w:lang w:val="en_US" w:bidi="en_US"/>
         </w:rPr>
-        <w:t>In this final section, Genesis records how Jacob’s family winds up in Egypt rather than in the land of Canaan. In spite of the tragic set of circumstances which led to their being in Egypt, God was still unfolding his plan for the people of Israel. The book closes with the promise of the Lord’s coming to rescue his people from Egypt (</w:t>
+        <w:t>In this final section, Genesis explains how Jacob's family ends up in Egypt instead of Canaan. Despite the tragic events that brought them to Egypt, God continues to reveal his plan for the people of Israel. The book ends with the promise that the Lord will come to rescue his people from Egypt (</w:t>
       </w:r>
       <w:hyperlink r:id="rId37">
         <w:r>
@@ -909,48 +1086,63 @@
         <w:rPr>
           <w:lang w:val="en_US" w:bidi="en_US"/>
         </w:rPr>
-        <w:t>Authorship</w:t>
-      </w:r>
-    </w:p>
-    <w:p>
-      <w:pPr/>
-      <w:r>
-        <w:rPr>
-          <w:lang w:val="en_US" w:bidi="en_US"/>
-        </w:rPr>
-      </w:r>
-      <w:r>
-        <w:rPr>
-          <w:lang w:val="en_US" w:bidi="en_US"/>
-        </w:rPr>
-        <w:t xml:space="preserve">Like many biblical books, the author of Genesis is not explicitly identified. Many scholars have argued that the Pentateuch (Genesis—Deuteronomy) is the product of a complex literary evolution. The prevailing view, called the </w:t>
-      </w:r>
-      <w:r>
-        <w:rPr>
-          <w:i/>
-          <w:lang w:val="en_US" w:bidi="en_US"/>
-        </w:rPr>
-        <w:t>Documentary Hypothesis,</w:t>
-      </w:r>
-      <w:r>
-        <w:rPr>
-          <w:lang w:val="en_US" w:bidi="en_US"/>
-        </w:rPr>
-        <w:t xml:space="preserve"> is that Genesis through Deuteronomy was compiled from various sources. This hypothesis proposes that the Pentateuch comes from four sources: J (“Jahwist,” from “Yahweh”), E (“Elohist,” from “Elohim”), D (“Deuteronomic,” from Deuteronomy), and P (“Priestly”). It is thought that these sources were written and collected between 850 BC and 445 BC, gradually being combined and edited until around Ezra’s time (400s BC).</w:t>
-      </w:r>
-    </w:p>
-    <w:p>
-      <w:pPr/>
-      <w:r>
-        <w:rPr>
-          <w:lang w:val="en_US" w:bidi="en_US"/>
-        </w:rPr>
-      </w:r>
-      <w:r>
-        <w:rPr>
-          <w:lang w:val="en_US" w:bidi="en_US"/>
-        </w:rPr>
-        <w:t>Both Scripture and tradition attribute the Pentateuch to Moses, however. Moses was educated in all the wisdom of the Egyptians (</w:t>
+        <w:t xml:space="preserve">Author </w:t>
+      </w:r>
+    </w:p>
+    <w:p>
+      <w:pPr/>
+      <w:r>
+        <w:rPr>
+          <w:lang w:val="en_US" w:bidi="en_US"/>
+        </w:rPr>
+      </w:r>
+      <w:r>
+        <w:rPr>
+          <w:lang w:val="en_US" w:bidi="en_US"/>
+        </w:rPr>
+        <w:t>Like many books of the Bible, Genesis does not identify its author. Many scholars believe that the Pentateuch (the first five books of the Bible: Genesis, Exodus, Leviticus, Numbers, and Deuteronomy) developed over a long period of time.</w:t>
+      </w:r>
+    </w:p>
+    <w:p>
+      <w:pPr/>
+      <w:r>
+        <w:rPr>
+          <w:lang w:val="en_US" w:bidi="en_US"/>
+        </w:rPr>
+      </w:r>
+      <w:r>
+        <w:rPr>
+          <w:lang w:val="en_US" w:bidi="en_US"/>
+        </w:rPr>
+        <w:t>One widely held view is the Documentary Hypothesis. This theory says that Genesis through Deuteronomy was compiled from several written sources. According to this view, the Pentateuch is based on four main sources: J ("Jahwist," associated with the name Yahweh), E ("Elohist," associated with the name Elohim), D ("Deuteronomic," associated with Deuteronomy), and P ("Priestly").</w:t>
+      </w:r>
+    </w:p>
+    <w:p>
+      <w:pPr/>
+      <w:r>
+        <w:rPr>
+          <w:lang w:val="en_US" w:bidi="en_US"/>
+        </w:rPr>
+      </w:r>
+      <w:r>
+        <w:rPr>
+          <w:lang w:val="en_US" w:bidi="en_US"/>
+        </w:rPr>
+        <w:t>Supporters of this theory believe that these sources were written and collected between about 850 BC and 445 BC. Over time, they were combined and edited into the form we have today, possibly as late as the time of Ezra in the 400s BC.</w:t>
+      </w:r>
+    </w:p>
+    <w:p>
+      <w:pPr/>
+      <w:r>
+        <w:rPr>
+          <w:lang w:val="en_US" w:bidi="en_US"/>
+        </w:rPr>
+      </w:r>
+      <w:r>
+        <w:rPr>
+          <w:lang w:val="en_US" w:bidi="en_US"/>
+        </w:rPr>
+        <w:t>However, both Scripture and Jewish and Christian tradition attribute the Pentateuch to Moses. Moses was educated in all the wisdom of Egypt (</w:t>
       </w:r>
       <w:hyperlink r:id="rId38">
         <w:r>
@@ -968,21 +1160,35 @@
         <w:rPr>
           <w:lang w:val="en_US" w:bidi="en_US"/>
         </w:rPr>
-        <w:t>), and he had the literary skills to collect and edit Israel’s traditions and records and to compose this theological treatise. His unique communion with God gave him the spiritual illumination, understanding, and inspiration needed to guide him. He had good reason to write this work—to provide Israel with the theological and historical foundation for the Exodus and the covenant at Sinai, and to establish the new nation in accord with the promises made to their ancestors.</w:t>
-      </w:r>
-    </w:p>
-    <w:p>
-      <w:pPr/>
-      <w:r>
-        <w:rPr>
-          <w:lang w:val="en_US" w:bidi="en_US"/>
-        </w:rPr>
-      </w:r>
-      <w:r>
-        <w:rPr>
-          <w:lang w:val="en_US" w:bidi="en_US"/>
-        </w:rPr>
-        <w:t xml:space="preserve">It is possible that Moses served as the fundamental source of the material recorded in the Pentateuch and that some editorial adjustments were subsequently made (including the record of Moses’ death, </w:t>
+        <w:t>). He had the skills needed to collect and organize Israel's traditions and records and to write this theological work.</w:t>
+      </w:r>
+    </w:p>
+    <w:p>
+      <w:pPr/>
+      <w:r>
+        <w:rPr>
+          <w:lang w:val="en_US" w:bidi="en_US"/>
+        </w:rPr>
+      </w:r>
+      <w:r>
+        <w:rPr>
+          <w:lang w:val="en_US" w:bidi="en_US"/>
+        </w:rPr>
+        <w:t>Moses also had a unique relationship with God. Through this relationship, God gave him the understanding and guidance needed for this task. He had good reason to write this work. It provided Israel with the theological and historical foundation for the Exodus and the covenant at Mount Sinai. It also helped establish the new nation on the basis of the promises God had made to their ancestors.</w:t>
+      </w:r>
+    </w:p>
+    <w:p>
+      <w:pPr/>
+      <w:r>
+        <w:rPr>
+          <w:lang w:val="en_US" w:bidi="en_US"/>
+        </w:rPr>
+      </w:r>
+      <w:r>
+        <w:rPr>
+          <w:lang w:val="en_US" w:bidi="en_US"/>
+        </w:rPr>
+        <w:t xml:space="preserve">It is possible that Moses was the main source of the material in the Pentateuch and that later editors made some changes to the text. These may have included passages such as the account of Moses's death (see </w:t>
       </w:r>
       <w:hyperlink r:id="rId39">
         <w:r>
@@ -993,14 +1199,14 @@
             <w:color w:val="0000EE"/>
             <w:u w:val="single"/>
           </w:rPr>
-          <w:t>Deut 34</w:t>
+          <w:t>Deuteronomy 34</w:t>
         </w:r>
       </w:hyperlink>
       <w:r>
         <w:rPr>
           <w:lang w:val="en_US" w:bidi="en_US"/>
         </w:rPr>
-        <w:t>). Regardless, the Israelites accepted the Pentateuch as bearing the full force of Moses’ authority.</w:t>
+        <w:t>). Regardless of how the Pentateuch reached its final form, the Israelites accepted it as having the full authority of Moses.</w:t>
       </w:r>
     </w:p>
     <w:p>
@@ -1025,21 +1231,35 @@
         <w:rPr>
           <w:lang w:val="en_US" w:bidi="en_US"/>
         </w:rPr>
-        <w:t>It is widely recognized that various sources were used in writing Genesis (and other historical texts in the Bible such as Kings and Luke. The author used collections of family records, oral traditions, ancient accounts of primeval events, and genealogies to write Genesis. Those sources could have been incorporated as received, or the author may have changed their style and wording, stitching them together with additional material for the particular purpose of tracing the foundations of Israelite faith.</w:t>
-      </w:r>
-    </w:p>
-    <w:p>
-      <w:pPr/>
-      <w:r>
-        <w:rPr>
-          <w:lang w:val="en_US" w:bidi="en_US"/>
-        </w:rPr>
-      </w:r>
-      <w:r>
-        <w:rPr>
-          <w:lang w:val="en_US" w:bidi="en_US"/>
-        </w:rPr>
-        <w:t xml:space="preserve">Genesis also includes passages and expressions that are obviously later editorial glosses. Some sections (such as the list of Edomite kings, </w:t>
+        <w:t>Most scholars agree that Genesis, like other historical books of the Bible such as Kings and Luke, was written using a variety of sources. The author drew on family records, oral traditions (stories passed down by word of mouth), ancient accounts of early human history, and genealogies (lists of ancestors).</w:t>
+      </w:r>
+    </w:p>
+    <w:p>
+      <w:pPr/>
+      <w:r>
+        <w:rPr>
+          <w:lang w:val="en_US" w:bidi="en_US"/>
+        </w:rPr>
+      </w:r>
+      <w:r>
+        <w:rPr>
+          <w:lang w:val="en_US" w:bidi="en_US"/>
+        </w:rPr>
+        <w:t>The author may have included these sources largely as they were received, or he may have revised their wording and style. He then combined them with additional material to show the foundations of Israel's faith and history.</w:t>
+      </w:r>
+    </w:p>
+    <w:p>
+      <w:pPr/>
+      <w:r>
+        <w:rPr>
+          <w:lang w:val="en_US" w:bidi="en_US"/>
+        </w:rPr>
+      </w:r>
+      <w:r>
+        <w:rPr>
+          <w:lang w:val="en_US" w:bidi="en_US"/>
+        </w:rPr>
+        <w:t>Genesis also contains some passages and expressions that appear to be later editorial additions. For example, some sections, such as the list of Edomite kings (</w:t>
       </w:r>
       <w:hyperlink r:id="rId40">
         <w:r>
@@ -1057,7 +1277,7 @@
         <w:rPr>
           <w:lang w:val="en_US" w:bidi="en_US"/>
         </w:rPr>
-        <w:t>) could have been added during the early days of the monarchy. There is no conflict in saying that Genesis was authored by Moses and augmented by subsequent editors whose work was guided by the Holy Spirit.</w:t>
+        <w:t>), may have been added during the early years of Israel's kings. For this reason, some scholars see no conflict between saying that Moses was the author of Genesis and that later editors added material under the guidance of the Holy Spirit.</w:t>
       </w:r>
     </w:p>
     <w:p>
@@ -1082,21 +1302,46 @@
         <w:rPr>
           <w:lang w:val="en_US" w:bidi="en_US"/>
         </w:rPr>
-        <w:t>Genesis includes various types of literature. Several suggestions have been made as to the nature of the materials.</w:t>
-      </w:r>
-    </w:p>
-    <w:p>
-      <w:pPr/>
-      <w:r>
-        <w:rPr>
-          <w:lang w:val="en_US" w:bidi="en_US"/>
-        </w:rPr>
-      </w:r>
-      <w:r>
-        <w:rPr>
-          <w:lang w:val="en_US" w:bidi="en_US"/>
-        </w:rPr>
-        <w:t xml:space="preserve">Myth. Mythological literature explains the origins of things symbolically through the deeds of gods and supernatural creatures. For ancient peoples, myths were beliefs that explained life and reality. Whole systems of ritual activities were developed to ensure that the forces of fertility, life, and death would continue year by year. Some of these rituals gave rise to cult prostitution (see </w:t>
+        <w:t>Genesis contains several types of literature. Scholars have suggested different ways of understanding these materials.</w:t>
+      </w:r>
+    </w:p>
+    <w:p>
+      <w:pPr>
+        <w:pStyle w:val="Heading3"/>
+      </w:pPr>
+      <w:r>
+        <w:rPr>
+          <w:lang w:val="en_US" w:bidi="en_US"/>
+        </w:rPr>
+        <w:t>Myth</w:t>
+      </w:r>
+    </w:p>
+    <w:p>
+      <w:pPr/>
+      <w:r>
+        <w:rPr>
+          <w:lang w:val="en_US" w:bidi="en_US"/>
+        </w:rPr>
+      </w:r>
+      <w:r>
+        <w:rPr>
+          <w:lang w:val="en_US" w:bidi="en_US"/>
+        </w:rPr>
+        <w:t>Mythological literature uses stories about gods and supernatural beings to explain how the world began and why things are the way they are. In the ancient world, many people believed these stories explained life and reality.</w:t>
+      </w:r>
+    </w:p>
+    <w:p>
+      <w:pPr/>
+      <w:r>
+        <w:rPr>
+          <w:lang w:val="en_US" w:bidi="en_US"/>
+        </w:rPr>
+      </w:r>
+      <w:r>
+        <w:rPr>
+          <w:lang w:val="en_US" w:bidi="en_US"/>
+        </w:rPr>
+        <w:t xml:space="preserve">People often practiced rituals (religious ceremonies) because they believed these actions would help ensure fertility (the ability to produce crops, animals, and children), life, and death would continue in their proper order from year to year. Some of these practices included cult prostitution (sexual acts performed as part of pagan worship; see </w:t>
       </w:r>
       <w:hyperlink r:id="rId41">
         <w:r>
@@ -1107,7 +1352,7 @@
             <w:color w:val="0000EE"/>
             <w:u w:val="single"/>
           </w:rPr>
-          <w:t>Gen 38:15</w:t>
+          <w:t>Genesis 38:15</w:t>
         </w:r>
       </w:hyperlink>
       <w:r>
@@ -1146,21 +1391,35 @@
         <w:rPr>
           <w:lang w:val="en_US" w:bidi="en_US"/>
         </w:rPr>
-        <w:t>It would be very difficult to classify the material in Genesis as simply a myth alongside the other myths of the earth’s origins. Israel had one God, not a multitude. The nation of Israel had a beginning, a history, and a future hope. They saw God, rather than gods and other supernatural creatures, as the primary actor in the world. Their worship was not cosmic, magical, or superstitious, but a reenactment of their own rescue from Egypt and a celebration of God’s actual intervention in history and their hope in his promises.</w:t>
-      </w:r>
-    </w:p>
-    <w:p>
-      <w:pPr/>
-      <w:r>
-        <w:rPr>
-          <w:lang w:val="en_US" w:bidi="en_US"/>
-        </w:rPr>
-      </w:r>
-      <w:r>
-        <w:rPr>
-          <w:lang w:val="en_US" w:bidi="en_US"/>
-        </w:rPr>
-        <w:t>If Genesis uses elements of mythological language, it is to display a deliberate contrast with pagan concepts and to show that the Lord God is sovereign over such ideas. For example, many ancient peoples worshiped the sun as a god, but in Genesis the sun serves the Creator’s wishes (</w:t>
+        <w:t>It is difficult to classify Genesis as simply a myth like other ancient stories about the origin of the world. Israel worshiped one God, not many gods. The people of Israel believed that their nation had a beginning, a history, and a future.</w:t>
+      </w:r>
+    </w:p>
+    <w:p>
+      <w:pPr/>
+      <w:r>
+        <w:rPr>
+          <w:lang w:val="en_US" w:bidi="en_US"/>
+        </w:rPr>
+      </w:r>
+      <w:r>
+        <w:rPr>
+          <w:lang w:val="en_US" w:bidi="en_US"/>
+        </w:rPr>
+        <w:t>They understood God (not gods or other supernatural beings) as the main actor in the world. Their worship was not based on magical practices or attempts to control the forces of nature. Instead, it remembered God's rescue of Israel from Egypt, celebrated his actions in history, and expressed hope in his promises.</w:t>
+      </w:r>
+    </w:p>
+    <w:p>
+      <w:pPr/>
+      <w:r>
+        <w:rPr>
+          <w:lang w:val="en_US" w:bidi="en_US"/>
+        </w:rPr>
+      </w:r>
+      <w:r>
+        <w:rPr>
+          <w:lang w:val="en_US" w:bidi="en_US"/>
+        </w:rPr>
+        <w:t>If Genesis uses language that is similar to ancient myths, it does so to contrast the God of Israel with pagan beliefs and to show that the Lord is sovereign (ruler over all things). For example, many ancient peoples worshiped the sun as a god, but in Genesis the sun is part of God's creation and obeys his command (</w:t>
       </w:r>
       <w:hyperlink r:id="rId43">
         <w:r>
@@ -1178,35 +1437,60 @@
         <w:rPr>
           <w:lang w:val="en_US" w:bidi="en_US"/>
         </w:rPr>
-        <w:t>). The book of Genesis is a cemetery for lifeless myths and dead gods.</w:t>
-      </w:r>
-    </w:p>
-    <w:p>
-      <w:pPr/>
-      <w:r>
-        <w:rPr>
-          <w:lang w:val="en_US" w:bidi="en_US"/>
-        </w:rPr>
-      </w:r>
-      <w:r>
-        <w:rPr>
-          <w:lang w:val="en_US" w:bidi="en_US"/>
-        </w:rPr>
-        <w:t>Etiology. A number of scholars describe the Genesis narratives as etiologies, stories that explain the causes of factual reality or traditional beliefs. The implication is that such stories were made up for explanatory purposes and do not describe historical events. For example, if one says that the story of Cain and Abel was made up to explain why shepherds and farmers do not get along, the account loses its integrity as factual history.</w:t>
-      </w:r>
-    </w:p>
-    <w:p>
-      <w:pPr/>
-      <w:r>
-        <w:rPr>
-          <w:lang w:val="en_US" w:bidi="en_US"/>
-        </w:rPr>
-      </w:r>
-      <w:r>
-        <w:rPr>
-          <w:lang w:val="en_US" w:bidi="en_US"/>
-        </w:rPr>
-        <w:t xml:space="preserve">Etiological elements certainly occur in Genesis, as the book gives the foundation and rationale for almost everything that Israel would later do. For example, the creation account of </w:t>
+        <w:t>). Rather than supporting ancient myths and false gods, Genesis shows that the Lord alone rules over creation.</w:t>
+      </w:r>
+    </w:p>
+    <w:p>
+      <w:pPr>
+        <w:pStyle w:val="Heading3"/>
+      </w:pPr>
+      <w:r>
+        <w:rPr>
+          <w:lang w:val="en_US" w:bidi="en_US"/>
+        </w:rPr>
+        <w:t>Etiology</w:t>
+      </w:r>
+    </w:p>
+    <w:p>
+      <w:pPr/>
+      <w:r>
+        <w:rPr>
+          <w:lang w:val="en_US" w:bidi="en_US"/>
+        </w:rPr>
+      </w:r>
+      <w:r>
+        <w:rPr>
+          <w:lang w:val="en_US" w:bidi="en_US"/>
+        </w:rPr>
+        <w:t>Some scholars describe the stories in Genesis as etiologies (stories that explain how a custom, belief, place, or situation came to exist). According to this view, these stories were created to explain things people observed or believed and are not intended to describe actual historical events.</w:t>
+      </w:r>
+    </w:p>
+    <w:p>
+      <w:pPr/>
+      <w:r>
+        <w:rPr>
+          <w:lang w:val="en_US" w:bidi="en_US"/>
+        </w:rPr>
+      </w:r>
+      <w:r>
+        <w:rPr>
+          <w:lang w:val="en_US" w:bidi="en_US"/>
+        </w:rPr>
+        <w:t>For example, some might argue that the story of Cain and Abel was created to explain conflict between shepherds and farmers. If that is the case, then the account is no longer understood as a record of a real historical event.</w:t>
+      </w:r>
+    </w:p>
+    <w:p>
+      <w:pPr/>
+      <w:r>
+        <w:rPr>
+          <w:lang w:val="en_US" w:bidi="en_US"/>
+        </w:rPr>
+      </w:r>
+      <w:r>
+        <w:rPr>
+          <w:lang w:val="en_US" w:bidi="en_US"/>
+        </w:rPr>
+        <w:t xml:space="preserve">For example, the creation account of </w:t>
       </w:r>
       <w:hyperlink r:id="rId44">
         <w:r>
@@ -1224,91 +1508,257 @@
         <w:rPr>
           <w:lang w:val="en_US" w:bidi="en_US"/>
         </w:rPr>
-        <w:t xml:space="preserve"> ends with the explanation, “This explains why a man leaves his father and mother. . . .” The event as it happened explains why marriage was conducted the way it was, but to say that a story explains something is quite different from saying that the story was fabricated to explain it. The stories of Genesis are not simply fictional tales invented to explain later customs and beliefs.</w:t>
-      </w:r>
-    </w:p>
-    <w:p>
-      <w:pPr/>
-      <w:r>
-        <w:rPr>
-          <w:lang w:val="en_US" w:bidi="en_US"/>
-        </w:rPr>
-      </w:r>
-      <w:r>
-        <w:rPr>
-          <w:lang w:val="en_US" w:bidi="en_US"/>
-        </w:rPr>
-        <w:t>History. Many scholars object to regarding Genesis as history, for two basic reasons: (1) Genesis explains events as caused by God, and the inclusion of the supernatural is regarded as proof that the material is theological reflection and thus not historically reliable; and (2) the events in Genesis cannot be validated from outside sources; no other records have demonstrated that Abraham existed or that any of his family history occurred.</w:t>
-      </w:r>
-    </w:p>
-    <w:p>
-      <w:pPr/>
-      <w:r>
-        <w:rPr>
-          <w:lang w:val="en_US" w:bidi="en_US"/>
-        </w:rPr>
-      </w:r>
-      <w:r>
-        <w:rPr>
-          <w:lang w:val="en_US" w:bidi="en_US"/>
-        </w:rPr>
-        <w:t>Modern philosophies of history exclude the supernatural as an explanation of historical events, but there is no reason to do so arbitrarily. If God exists and is able to act, then he might very well be the ultimate cause of all historical events and the immediate cause of specific historical events. The Israelites were not as distrustful of supernatural events as are modern critics; they recognized such events as God acting among them to fulfill the promises recorded in Genesis.</w:t>
-      </w:r>
-    </w:p>
-    <w:p>
-      <w:pPr/>
-      <w:r>
-        <w:rPr>
-          <w:lang w:val="en_US" w:bidi="en_US"/>
-        </w:rPr>
-      </w:r>
-      <w:r>
-        <w:rPr>
-          <w:lang w:val="en_US" w:bidi="en_US"/>
-        </w:rPr>
-        <w:t>It is true that no direct evidence of the patriarchs or the events in Genesis has been found, but archaeology confirms the plausibility of Genesis by showing that the historical situation in that era (Middle Bronze I, 2000–1800 BC) corresponds closely to what Genesis portrays. The details of the narratives make perfectly good sense in that context.</w:t>
-      </w:r>
-    </w:p>
-    <w:p>
-      <w:pPr/>
-      <w:r>
-        <w:rPr>
-          <w:lang w:val="en_US" w:bidi="en_US"/>
-        </w:rPr>
-      </w:r>
-      <w:r>
-        <w:rPr>
-          <w:lang w:val="en_US" w:bidi="en_US"/>
-        </w:rPr>
-        <w:t>Theological Interpretation. Genesis was not intended as a chronicle of the lives of the patriarchs, a history for history’s sake, or a complete biography. It is clearly a theological interpretation of selected records of the nation’s ancestors, but this does not damage its historicity. Interpretations of an event can differ, but the offering of interpretations is a good witness to the actuality of the events. The author retold the events in his own way, incorporating particular theological emphases, but that does not mean that the stories were invented.</w:t>
-      </w:r>
-    </w:p>
-    <w:p>
-      <w:pPr/>
-      <w:r>
-        <w:rPr>
-          <w:lang w:val="en_US" w:bidi="en_US"/>
-        </w:rPr>
-      </w:r>
-      <w:r>
-        <w:rPr>
-          <w:lang w:val="en_US" w:bidi="en_US"/>
-        </w:rPr>
-        <w:t>Tradition. What was thus committed to writing is tradition in the reverent care of literary genius. It is possible that Abram brought the primeval accounts and the family genealogies from Mesopotamia, and stories about the family were added to these collections. Joseph could easily have preserved all the traditions, both written and oral, in Egypt with his own records. Then, Moses could have compiled the works substantially in their present form while adding his editorial comments, working under God’s inspiration and guidance.</w:t>
-      </w:r>
-    </w:p>
-    <w:p>
-      <w:pPr/>
-      <w:r>
-        <w:rPr>
-          <w:lang w:val="en_US" w:bidi="en_US"/>
-        </w:rPr>
-      </w:r>
-      <w:r>
-        <w:rPr>
-          <w:lang w:val="en_US" w:bidi="en_US"/>
-        </w:rPr>
-        <w:t>Instructional Literature. Since Genesis is the first book of the Pentateuch (the “Torah” or Law), it may be best to classify it as “Torah Literature” (Hebrew torah, “instruction, law”). Genesis is instructional literature that lays the foundation for the Law. It includes theological interpretation of the historical traditions standing behind the covenant at Sinai. It thus prepares its readers to receive God’s law and to connect themselves to the promises made to their forefathers. Genesis is therefore a unique work. Theology, history, and tradition come together to instruct God’s people and prepare them for blessing.</w:t>
+        <w:t xml:space="preserve"> ends with the explanation, “</w:t>
+      </w:r>
+      <w:r>
+        <w:rPr>
+          <w:lang w:val="en_US" w:bidi="en_US"/>
+        </w:rPr>
+        <w:t>For this reason a man will leave his father and mother …</w:t>
+      </w:r>
+      <w:r>
+        <w:rPr>
+          <w:lang w:val="en_US" w:bidi="en_US"/>
+        </w:rPr>
+        <w:t>” The event itself may explain why marriage was practiced in a particular way. However, saying that a story explains a custom is different from saying that the story was invented to explain it. The stories in Genesis are not simply fictional accounts created to explain later customs and beliefs.</w:t>
+      </w:r>
+    </w:p>
+    <w:p>
+      <w:pPr>
+        <w:pStyle w:val="Heading3"/>
+      </w:pPr>
+      <w:r>
+        <w:rPr>
+          <w:lang w:val="en_US" w:bidi="en_US"/>
+        </w:rPr>
+        <w:t>History</w:t>
+      </w:r>
+    </w:p>
+    <w:p>
+      <w:pPr/>
+      <w:r>
+        <w:rPr>
+          <w:lang w:val="en_US" w:bidi="en_US"/>
+        </w:rPr>
+      </w:r>
+      <w:r>
+        <w:rPr>
+          <w:lang w:val="en_US" w:bidi="en_US"/>
+        </w:rPr>
+        <w:t>Many scholars do not regard Genesis as historical for two main reasons:</w:t>
+      </w:r>
+    </w:p>
+    <w:p>
+      <w:pPr>
+        <w:pStyle w:val="ListNumber"/>
+        <w:numPr>
+          <w:ilvl w:val="0"/>
+          <w:numId w:val="14"/>
+        </w:numPr>
+        <w:spacing w:line="240" w:lineRule="auto"/>
+        <w:ind w:left="720"/>
+      </w:pPr>
+      <w:r>
+        <w:rPr>
+          <w:lang w:val="en_US" w:bidi="en_US"/>
+        </w:rPr>
+      </w:r>
+      <w:r>
+        <w:rPr>
+          <w:lang w:val="en_US" w:bidi="en_US"/>
+        </w:rPr>
+        <w:t>Genesis explains events as acts of God. Some scholars argue that the presence of supernatural events shows that the book is primarily theological reflection rather than reliable history.</w:t>
+      </w:r>
+    </w:p>
+    <w:p>
+      <w:pPr>
+        <w:pStyle w:val="ListNumber"/>
+        <w:spacing w:line="240" w:lineRule="auto"/>
+        <w:ind w:left="720"/>
+      </w:pPr>
+      <w:r>
+        <w:rPr>
+          <w:lang w:val="en_US" w:bidi="en_US"/>
+        </w:rPr>
+      </w:r>
+      <w:r>
+        <w:rPr>
+          <w:lang w:val="en_US" w:bidi="en_US"/>
+        </w:rPr>
+        <w:t>Many of the events in Genesis cannot be confirmed by evidence outside the Bible. For example, no known ancient records have demonstrated that Abraham existed or that the events of his family history took place as described.</w:t>
+      </w:r>
+    </w:p>
+    <w:p>
+      <w:pPr/>
+      <w:r>
+        <w:rPr>
+          <w:lang w:val="en_US" w:bidi="en_US"/>
+        </w:rPr>
+      </w:r>
+      <w:r>
+        <w:rPr>
+          <w:lang w:val="en_US" w:bidi="en_US"/>
+        </w:rPr>
+        <w:t>Many modern approaches to history do not accept supernatural events as explanations for historical events. However, there is no necessary reason to reject that possibility. If God exists and is able to act in the world, then he may be the ultimate cause of all historical events and the direct cause of particular events.</w:t>
+      </w:r>
+    </w:p>
+    <w:p>
+      <w:pPr/>
+      <w:r>
+        <w:rPr>
+          <w:lang w:val="en_US" w:bidi="en_US"/>
+        </w:rPr>
+      </w:r>
+      <w:r>
+        <w:rPr>
+          <w:lang w:val="en_US" w:bidi="en_US"/>
+        </w:rPr>
+        <w:t>Unlike many modern critics, the Israelites did not reject reports of supernatural events. They understood these events as God's actions among them to fulfill the promises recorded in Genesis.</w:t>
+      </w:r>
+    </w:p>
+    <w:p>
+      <w:pPr/>
+      <w:r>
+        <w:rPr>
+          <w:lang w:val="en_US" w:bidi="en_US"/>
+        </w:rPr>
+      </w:r>
+      <w:r>
+        <w:rPr>
+          <w:lang w:val="en_US" w:bidi="en_US"/>
+        </w:rPr>
+        <w:t>It is true that no direct evidence for the patriarchs (Israel's early ancestors) or the events described in Genesis has been found. However, archaeological discoveries support the historical plausibility of Genesis. They show that the historical setting of that period (Middle Bronze I, about 2000–1800 BC) closely matches the world described in the book. The details of the narratives fit well within that historical setting.</w:t>
+      </w:r>
+    </w:p>
+    <w:p>
+      <w:pPr>
+        <w:pStyle w:val="Heading3"/>
+      </w:pPr>
+      <w:r>
+        <w:rPr>
+          <w:lang w:val="en_US" w:bidi="en_US"/>
+        </w:rPr>
+        <w:t>Theological Interpretation</w:t>
+      </w:r>
+    </w:p>
+    <w:p>
+      <w:pPr/>
+      <w:r>
+        <w:rPr>
+          <w:lang w:val="en_US" w:bidi="en_US"/>
+        </w:rPr>
+      </w:r>
+      <w:r>
+        <w:rPr>
+          <w:lang w:val="en_US" w:bidi="en_US"/>
+        </w:rPr>
+        <w:t>Genesis was not written simply as a record of the lives of the patriarchs, a history written only to preserve facts, or a complete biography. Instead, it presents a theological interpretation of selected accounts about Israel's ancestors. However, this does not mean that the events were not historical.</w:t>
+      </w:r>
+    </w:p>
+    <w:p>
+      <w:pPr/>
+      <w:r>
+        <w:rPr>
+          <w:lang w:val="en_US" w:bidi="en_US"/>
+        </w:rPr>
+      </w:r>
+      <w:r>
+        <w:rPr>
+          <w:lang w:val="en_US" w:bidi="en_US"/>
+        </w:rPr>
+        <w:t>People may interpret the same event in different ways, but the existence of these interpretations points to the reality of the event itself. The author retold these events from a particular theological perspective and emphasized certain themes. However, this does not mean that the stories were invented.</w:t>
+      </w:r>
+    </w:p>
+    <w:p>
+      <w:pPr>
+        <w:pStyle w:val="Heading3"/>
+      </w:pPr>
+      <w:r>
+        <w:rPr>
+          <w:lang w:val="en_US" w:bidi="en_US"/>
+        </w:rPr>
+        <w:t>Tradition</w:t>
+      </w:r>
+    </w:p>
+    <w:p>
+      <w:pPr/>
+      <w:r>
+        <w:rPr>
+          <w:lang w:val="en_US" w:bidi="en_US"/>
+        </w:rPr>
+      </w:r>
+      <w:r>
+        <w:rPr>
+          <w:lang w:val="en_US" w:bidi="en_US"/>
+        </w:rPr>
+        <w:t>The material that was eventually written down may have been preserved through a carefully maintained tradition. Some scholars suggest that Abram brought early accounts of the world's beginnings and family genealogies from Mesopotamia. Later, stories about his family may have been added to these collections.</w:t>
+      </w:r>
+    </w:p>
+    <w:p>
+      <w:pPr/>
+      <w:r>
+        <w:rPr>
+          <w:lang w:val="en_US" w:bidi="en_US"/>
+        </w:rPr>
+      </w:r>
+      <w:r>
+        <w:rPr>
+          <w:lang w:val="en_US" w:bidi="en_US"/>
+        </w:rPr>
+        <w:t>Joseph may have preserved these traditions in Egypt, both in written form and through oral tradition, along with his own records. Moses may then have gathered and organized these materials into a form close to the Pentateuch we have today. He may also have added editorial comments while working under God's inspiration and guidance.</w:t>
+      </w:r>
+    </w:p>
+    <w:p>
+      <w:pPr>
+        <w:pStyle w:val="Heading3"/>
+      </w:pPr>
+      <w:r>
+        <w:rPr>
+          <w:lang w:val="en_US" w:bidi="en_US"/>
+        </w:rPr>
+        <w:t>Instructional Literature</w:t>
+      </w:r>
+    </w:p>
+    <w:p>
+      <w:pPr/>
+      <w:r>
+        <w:rPr>
+          <w:lang w:val="en_US" w:bidi="en_US"/>
+        </w:rPr>
+      </w:r>
+      <w:r>
+        <w:rPr>
+          <w:lang w:val="en_US" w:bidi="en_US"/>
+        </w:rPr>
+        <w:t>Because Genesis is the first book of the Pentateuch, it may be best understood as part of the Torah (Hebrew for "instruction" or "law"). Genesis is an instructional book that provides the foundation for the Law.</w:t>
+      </w:r>
+    </w:p>
+    <w:p>
+      <w:pPr/>
+      <w:r>
+        <w:rPr>
+          <w:lang w:val="en_US" w:bidi="en_US"/>
+        </w:rPr>
+      </w:r>
+      <w:r>
+        <w:rPr>
+          <w:lang w:val="en_US" w:bidi="en_US"/>
+        </w:rPr>
+        <w:t>The book includes a theological interpretation of the historical traditions that stand behind God's covenant at Sinai. In this way, it prepares people to receive God's law and to understand their connection to the promises God made to their ancestors.</w:t>
+      </w:r>
+    </w:p>
+    <w:p>
+      <w:pPr/>
+      <w:r>
+        <w:rPr>
+          <w:lang w:val="en_US" w:bidi="en_US"/>
+        </w:rPr>
+      </w:r>
+      <w:r>
+        <w:rPr>
+          <w:lang w:val="en_US" w:bidi="en_US"/>
+        </w:rPr>
+        <w:t>Genesis is therefore a unique book. It brings together theology, history, and tradition to teach God's people and prepare them to receive his blessing.</w:t>
       </w:r>
     </w:p>
     <w:p>
@@ -1333,35 +1783,60 @@
         <w:rPr>
           <w:lang w:val="en_US" w:bidi="en_US"/>
         </w:rPr>
-        <w:t>Israel’s most important questions were answered by the Genesis narratives. Life and death, the possession of the land of Canaan, and how Israel ended up in Egypt are explained as God’s providential working in history. Israel is presented as having an integral part in God’s plan for the world. His plan had a starting point at creation and will have an end point in the future when the promises are completely fulfilled.</w:t>
-      </w:r>
-    </w:p>
-    <w:p>
-      <w:pPr/>
-      <w:r>
-        <w:rPr>
-          <w:lang w:val="en_US" w:bidi="en_US"/>
-        </w:rPr>
-      </w:r>
-      <w:r>
-        <w:rPr>
-          <w:lang w:val="en_US" w:bidi="en_US"/>
-        </w:rPr>
-        <w:t>Israel, the Chosen People. The central theme of Genesis is that God made a covenant with Abraham and his descendants. He promised to make them his own people, heirs of the land of Canaan, and make them a blessing to the world. Genesis gave Israel the theological and historical basis for its existence as God’s chosen people.</w:t>
-      </w:r>
-    </w:p>
-    <w:p>
-      <w:pPr/>
-      <w:r>
-        <w:rPr>
-          <w:lang w:val="en_US" w:bidi="en_US"/>
-        </w:rPr>
-      </w:r>
-      <w:r>
-        <w:rPr>
-          <w:lang w:val="en_US" w:bidi="en_US"/>
-        </w:rPr>
-        <w:t>Israel could trace its ancestry to the patriarch Abraham and its destiny to God’s promises (</w:t>
+        <w:t>Genesis answers some of Israel's most important questions. It explains life and death, Israel's connection to the land of Canaan, and how the people of Israel came to live in Egypt. These events are presented as part of God's providence (his guidance and care) in history.</w:t>
+      </w:r>
+    </w:p>
+    <w:p>
+      <w:pPr/>
+      <w:r>
+        <w:rPr>
+          <w:lang w:val="en_US" w:bidi="en_US"/>
+        </w:rPr>
+      </w:r>
+      <w:r>
+        <w:rPr>
+          <w:lang w:val="en_US" w:bidi="en_US"/>
+        </w:rPr>
+        <w:t>Genesis also shows that Israel has an important place in God's plan for the world. That plan began with creation and will reach its fulfillment in the future, when all of God's promises are completely fulfilled.</w:t>
+      </w:r>
+    </w:p>
+    <w:p>
+      <w:pPr>
+        <w:pStyle w:val="Heading3"/>
+      </w:pPr>
+      <w:r>
+        <w:rPr>
+          <w:lang w:val="en_US" w:bidi="en_US"/>
+        </w:rPr>
+        <w:t>Israel, the Chosen People</w:t>
+      </w:r>
+    </w:p>
+    <w:p>
+      <w:pPr/>
+      <w:r>
+        <w:rPr>
+          <w:lang w:val="en_US" w:bidi="en_US"/>
+        </w:rPr>
+      </w:r>
+      <w:r>
+        <w:rPr>
+          <w:lang w:val="en_US" w:bidi="en_US"/>
+        </w:rPr>
+        <w:t>The central theme of Genesis is God's covenant with Abraham and his descendants. God promised to make them his own people, give them the land of Canaan as their inheritance, and make them a blessing to the world. Genesis gave Israel the theological and historical foundation for understanding its identity as God's chosen people.</w:t>
+      </w:r>
+    </w:p>
+    <w:p>
+      <w:pPr/>
+      <w:r>
+        <w:rPr>
+          <w:lang w:val="en_US" w:bidi="en_US"/>
+        </w:rPr>
+      </w:r>
+      <w:r>
+        <w:rPr>
+          <w:lang w:val="en_US" w:bidi="en_US"/>
+        </w:rPr>
+        <w:t>Israel could trace its ancestry back to Abraham and its future to God's promises (</w:t>
       </w:r>
       <w:hyperlink r:id="rId45">
         <w:r>
@@ -1415,49 +1890,127 @@
         <w:rPr>
           <w:lang w:val="en_US" w:bidi="en_US"/>
         </w:rPr>
-        <w:t>). Because the promise of a great nation was crucial, much of Genesis is devoted to family concerns of the patriarchs and their wives, their sons and heirs, and their birthrights and blessings. The record shows how God preserved and protected the chosen line through the patriarchs. Israel thus knew that they had become the great nation promised to Abraham. Their future was certainly not in slavery to the Egyptians, but in Canaan, where they would live as a free nation and as the people of the living God, and where they could mediate God’s blessings to the people of the world.</w:t>
-      </w:r>
-    </w:p>
-    <w:p>
-      <w:pPr/>
-      <w:r>
-        <w:rPr>
-          <w:lang w:val="en_US" w:bidi="en_US"/>
-        </w:rPr>
-      </w:r>
-      <w:r>
-        <w:rPr>
-          <w:lang w:val="en_US" w:bidi="en_US"/>
-        </w:rPr>
-        <w:t>Blessing and Curse. The entire message of Genesis turns on the motifs of blessing and cursing. The promised blessing would give the patriarchs innumerable descendants and give the descendants the land of promise; the blessing would give them fame, enable them to flourish and prosper, and appoint them to bring others into the covenant blessings. The curse, meanwhile, would alienate, deprive, and disinherit people from the blessing. The effects of the curse are felt by the whole race as death and pain and as God’s judgment on the world.</w:t>
-      </w:r>
-    </w:p>
-    <w:p>
-      <w:pPr/>
-      <w:r>
-        <w:rPr>
-          <w:lang w:val="en_US" w:bidi="en_US"/>
-        </w:rPr>
-      </w:r>
-      <w:r>
-        <w:rPr>
-          <w:lang w:val="en_US" w:bidi="en_US"/>
-        </w:rPr>
-        <w:t>These motifs continue throughout the Bible. Prophets and priests spoke of even greater blessings in the future and an even greater curse for those who refuse God’s gift of salvation and its blessings. The Bible reminds God’s people not to fear human beings, but to fear God, who has the power to bless and to curse.</w:t>
-      </w:r>
-    </w:p>
-    <w:p>
-      <w:pPr/>
-      <w:r>
-        <w:rPr>
-          <w:lang w:val="en_US" w:bidi="en_US"/>
-        </w:rPr>
-      </w:r>
-      <w:r>
-        <w:rPr>
-          <w:lang w:val="en_US" w:bidi="en_US"/>
-        </w:rPr>
-        <w:t xml:space="preserve">Good and Evil. In Genesis, that which is good is blessed by God: It produces, enhances, preserves, and harmonizes with life. That which is evil is cursed: It causes pain, diverts from what is good, and impedes or destroys life. Genesis traces the perpetual struggle between good and evil that characterizes our fallen human race. God will bring about the greater good, build the faith of his people, and ultimately triumph over all evil (cp. </w:t>
+        <w:t>). Because God's promise to make Abraham's descendants into a great nation was so important, much of Genesis focuses on the families of the patriarchs. The book tells about their wives, sons, heirs, birthrights, and blessings. These accounts show how God preserved and protected the family line he had chosen. As a result, Israel could see that it had become the great nation God promised to Abraham.</w:t>
+      </w:r>
+    </w:p>
+    <w:p>
+      <w:pPr/>
+      <w:r>
+        <w:rPr>
+          <w:lang w:val="en_US" w:bidi="en_US"/>
+        </w:rPr>
+      </w:r>
+      <w:r>
+        <w:rPr>
+          <w:lang w:val="en_US" w:bidi="en_US"/>
+        </w:rPr>
+        <w:t>Israel's future was not meant to be slavery in Egypt. Instead, God intended to bring his people into Canaan, where they would live as a free nation and as the people of the living God. From there, they would bring God's blessing to the nations of the world.</w:t>
+      </w:r>
+    </w:p>
+    <w:p>
+      <w:pPr>
+        <w:pStyle w:val="Heading3"/>
+      </w:pPr>
+      <w:r>
+        <w:rPr>
+          <w:lang w:val="en_US" w:bidi="en_US"/>
+        </w:rPr>
+        <w:t>Blessing and Curse</w:t>
+      </w:r>
+    </w:p>
+    <w:p>
+      <w:pPr/>
+      <w:r>
+        <w:rPr>
+          <w:lang w:val="en_US" w:bidi="en_US"/>
+        </w:rPr>
+      </w:r>
+      <w:r>
+        <w:rPr>
+          <w:lang w:val="en_US" w:bidi="en_US"/>
+        </w:rPr>
+        <w:t xml:space="preserve">The themes of blessing and curse are central to the message of Genesis. God's promised blessing included giving the patriarchs many descendants and giving those descendants the promised land. The blessing would also bring honor, help them prosper, and enable them to bring others into the blessings of God's covenant. </w:t>
+      </w:r>
+    </w:p>
+    <w:p>
+      <w:pPr/>
+      <w:r>
+        <w:rPr>
+          <w:lang w:val="en_US" w:bidi="en_US"/>
+        </w:rPr>
+      </w:r>
+      <w:r>
+        <w:rPr>
+          <w:lang w:val="en_US" w:bidi="en_US"/>
+        </w:rPr>
+        <w:t>The curse, in contrast, would separate people from these blessings. It would bring loss and remove their inheritance. The effects of the curse are seen throughout humanity in death, suffering, and God's judgment on the world.</w:t>
+      </w:r>
+    </w:p>
+    <w:p>
+      <w:pPr/>
+      <w:r>
+        <w:rPr>
+          <w:lang w:val="en_US" w:bidi="en_US"/>
+        </w:rPr>
+      </w:r>
+      <w:r>
+        <w:rPr>
+          <w:lang w:val="en_US" w:bidi="en_US"/>
+        </w:rPr>
+        <w:t>These themes continue throughout the rest of the Bible. The prophets and priests spoke of even greater blessings that God would bring in the future. They also warned of a greater curse for those who reject God's offer of salvation (rescue from sin and its consequences) and the blessings that come with it.</w:t>
+      </w:r>
+    </w:p>
+    <w:p>
+      <w:pPr/>
+      <w:r>
+        <w:rPr>
+          <w:lang w:val="en_US" w:bidi="en_US"/>
+        </w:rPr>
+      </w:r>
+      <w:r>
+        <w:rPr>
+          <w:lang w:val="en_US" w:bidi="en_US"/>
+        </w:rPr>
+        <w:t>The Bible teaches God's people not to fear other people, but to fear God, who has the power to bless and to judge.</w:t>
+      </w:r>
+    </w:p>
+    <w:p>
+      <w:pPr>
+        <w:pStyle w:val="Heading3"/>
+      </w:pPr>
+      <w:r>
+        <w:rPr>
+          <w:lang w:val="en_US" w:bidi="en_US"/>
+        </w:rPr>
+        <w:t>Good and Evil</w:t>
+      </w:r>
+    </w:p>
+    <w:p>
+      <w:pPr/>
+      <w:r>
+        <w:rPr>
+          <w:lang w:val="en_US" w:bidi="en_US"/>
+        </w:rPr>
+      </w:r>
+      <w:r>
+        <w:rPr>
+          <w:lang w:val="en_US" w:bidi="en_US"/>
+        </w:rPr>
+        <w:t>In Genesis, what is good receives God's blessing. It supports life, helps life grow, protects life, and promotes harmony. What is evil comes under God's curse. It causes suffering, leads people away from what is good, and harms or destroys life.</w:t>
+      </w:r>
+    </w:p>
+    <w:p>
+      <w:pPr/>
+      <w:r>
+        <w:rPr>
+          <w:lang w:val="en_US" w:bidi="en_US"/>
+        </w:rPr>
+      </w:r>
+      <w:r>
+        <w:rPr>
+          <w:lang w:val="en_US" w:bidi="en_US"/>
+        </w:rPr>
+        <w:t xml:space="preserve">Genesis follows the ongoing struggle between good and evil in a fallen world affected by sin. The book shows that God works to bring good out of difficult situations, strengthen the faith of his people, and ultimately overcome all evil (compare </w:t>
       </w:r>
       <w:hyperlink r:id="rId48">
         <w:r>
@@ -1468,7 +2021,7 @@
             <w:color w:val="0000EE"/>
             <w:u w:val="single"/>
           </w:rPr>
-          <w:t>Rom 8:28</w:t>
+          <w:t>Romans 8:28</w:t>
         </w:r>
       </w:hyperlink>
       <w:r>
@@ -1479,31 +2032,107 @@
       </w:r>
     </w:p>
     <w:p>
-      <w:pPr/>
-      <w:r>
-        <w:rPr>
-          <w:lang w:val="en_US" w:bidi="en_US"/>
-        </w:rPr>
-      </w:r>
-      <w:r>
-        <w:rPr>
-          <w:lang w:val="en_US" w:bidi="en_US"/>
-        </w:rPr>
-        <w:t>God’s Plan. Genesis begins with the presupposition that God exists and that he has revealed himself in word and deed to Israel’s ancestors. It does not argue for the existence of God; it simply begins with God and shows how everything falls into place when the sovereign God works out his plan to establish Israel as the means of restoring blessing to the whole world.</w:t>
-      </w:r>
-    </w:p>
-    <w:p>
-      <w:pPr/>
-      <w:r>
-        <w:rPr>
-          <w:lang w:val="en_US" w:bidi="en_US"/>
-        </w:rPr>
-      </w:r>
-      <w:r>
-        <w:rPr>
-          <w:lang w:val="en_US" w:bidi="en_US"/>
-        </w:rPr>
-        <w:t>God’s Rule. Genesis is the fitting introduction to the founding of theocracy, the rule of God over all creation that was to be established through his chosen people. Genesis lays down the initial revelation of God’s sovereignty. He is the Lord of the universe who will move heaven and earth to bring about his plan. He desires to bless people, but he will not tolerate rebellion and unbelief. His promises are great, and he is fully able to bring them to fruition. To participate in his plan has always required faith, for without faith it is impossible to please him (</w:t>
+      <w:pPr>
+        <w:pStyle w:val="Heading3"/>
+      </w:pPr>
+      <w:r>
+        <w:rPr>
+          <w:lang w:val="en_US" w:bidi="en_US"/>
+        </w:rPr>
+        <w:t>God’s Plan</w:t>
+      </w:r>
+    </w:p>
+    <w:p>
+      <w:pPr/>
+      <w:r>
+        <w:rPr>
+          <w:lang w:val="en_US" w:bidi="en_US"/>
+        </w:rPr>
+      </w:r>
+      <w:r>
+        <w:rPr>
+          <w:lang w:val="en_US" w:bidi="en_US"/>
+        </w:rPr>
+        <w:t>Genesis begins with the assumption that God exists and that he revealed himself through his words and actions to Israel's ancestors. The book does not try to prove that God exists. Instead, it begins with God and shows how he carries out his plan.</w:t>
+      </w:r>
+    </w:p>
+    <w:p>
+      <w:pPr/>
+      <w:r>
+        <w:rPr>
+          <w:lang w:val="en_US" w:bidi="en_US"/>
+        </w:rPr>
+      </w:r>
+      <w:r>
+        <w:rPr>
+          <w:lang w:val="en_US" w:bidi="en_US"/>
+        </w:rPr>
+        <w:t>Genesis shows how the sovereign God (the ruler over all things) works to establish Israel as the means through which he would restore blessing to the world.</w:t>
+      </w:r>
+    </w:p>
+    <w:p>
+      <w:pPr>
+        <w:pStyle w:val="Heading3"/>
+      </w:pPr>
+      <w:r>
+        <w:rPr>
+          <w:lang w:val="en_US" w:bidi="en_US"/>
+        </w:rPr>
+        <w:t>God’s Rule</w:t>
+      </w:r>
+    </w:p>
+    <w:p>
+      <w:pPr/>
+      <w:r>
+        <w:rPr>
+          <w:lang w:val="en_US" w:bidi="en_US"/>
+        </w:rPr>
+      </w:r>
+      <w:r>
+        <w:rPr>
+          <w:lang w:val="en_US" w:bidi="en_US"/>
+        </w:rPr>
+        <w:t>Genesis provides a fitting introduction to God's rule over all creation through his chosen people. It introduces the idea that God is sovereign over all things and begins to reveal how he carries out his purposes in the world.</w:t>
+      </w:r>
+    </w:p>
+    <w:p>
+      <w:pPr/>
+      <w:r>
+        <w:rPr>
+          <w:lang w:val="en_US" w:bidi="en_US"/>
+        </w:rPr>
+      </w:r>
+      <w:r>
+        <w:rPr>
+          <w:lang w:val="en_US" w:bidi="en_US"/>
+        </w:rPr>
+        <w:t>God is the Lord of the universe, and nothing can prevent him from accomplishing his plan. He desires to bless people, but he does not accept rebellion and unbelief. His promises are great, and he has the power to fulfill them.</w:t>
+      </w:r>
+    </w:p>
+    <w:p>
+      <w:pPr/>
+      <w:r>
+        <w:rPr>
+          <w:lang w:val="en_US" w:bidi="en_US"/>
+        </w:rPr>
+      </w:r>
+      <w:r>
+        <w:rPr>
+          <w:lang w:val="en_US" w:bidi="en_US"/>
+        </w:rPr>
+        <w:t>From the beginning, participation in God's plan has required faith (trust in God). As Scripture says, "</w:t>
+      </w:r>
+      <w:r>
+        <w:rPr>
+          <w:lang w:val="en_US" w:bidi="en_US"/>
+        </w:rPr>
+        <w:t>without faith it is impossible to please God"</w:t>
+      </w:r>
+      <w:r>
+        <w:rPr>
+          <w:lang w:val="en_US" w:bidi="en_US"/>
+        </w:rPr>
+        <w:t xml:space="preserve"> (</w:t>
       </w:r>
       <w:hyperlink r:id="rId49">
         <w:r>
@@ -1514,7 +2143,7 @@
             <w:color w:val="0000EE"/>
             <w:u w:val="single"/>
           </w:rPr>
-          <w:t>Heb 11:6</w:t>
+          <w:t>Hebrews 11:6</w:t>
         </w:r>
       </w:hyperlink>
       <w:r>
@@ -3423,6 +4052,12 @@
   </w:num>
   <w:num w:numId="13" w16cid:durableId="592781308">
     <w:abstractNumId w:val="11"/>
+  </w:num>
+  <w:num w:numId="14">
+    <w:abstractNumId w:val="3"/>
+    <w:lvlOverride w:ilvl="0">
+      <w:startOverride w:val="1"/>
+    </w:lvlOverride>
   </w:num>
   <w:numIdMacAtCleanup w:val="10"/>
 </w:numbering>

</xml_diff>